<commit_message>
Changed the formatting for the squared numbers in Lab 8 doc.
</commit_message>
<xml_diff>
--- a/Lab 8 Evidence.docx
+++ b/Lab 8 Evidence.docx
@@ -4,6 +4,9 @@
   <w:body>
     <w:p>
       <w:pPr>
+        <w:tabs>
+          <w:tab w:val="left" w:pos="3135"/>
+        </w:tabs>
         <w:rPr>
           <w:b/>
           <w:bCs/>
@@ -23,16 +26,20 @@
     </w:p>
     <w:p>
       <w:pPr>
+        <w:tabs>
+          <w:tab w:val="left" w:pos="3135"/>
+        </w:tabs>
         <w:rPr>
           <w:b/>
           <w:bCs/>
-          <w:sz w:val="32"/>
-          <w:szCs w:val="32"/>
         </w:rPr>
       </w:pPr>
     </w:p>
     <w:p>
       <w:pPr>
+        <w:tabs>
+          <w:tab w:val="left" w:pos="3135"/>
+        </w:tabs>
         <w:rPr>
           <w:b/>
           <w:bCs/>
@@ -47,236 +54,467 @@
       </w:r>
     </w:p>
     <w:p>
-      <w:r>
+      <w:pPr>
+        <w:tabs>
+          <w:tab w:val="left" w:pos="3135"/>
+        </w:tabs>
+        <w:rPr>
+          <w:b/>
+          <w:bCs/>
+        </w:rPr>
+      </w:pPr>
+    </w:p>
+    <w:p>
+      <w:pPr>
+        <w:tabs>
+          <w:tab w:val="left" w:pos="3135"/>
+        </w:tabs>
+        <w:rPr>
+          <w:b/>
+          <w:bCs/>
+        </w:rPr>
+      </w:pPr>
+      <w:r>
+        <w:rPr>
+          <w:b/>
+          <w:bCs/>
+        </w:rPr>
         <w:t>1)</w:t>
       </w:r>
     </w:p>
     <w:p>
+      <w:pPr>
+        <w:tabs>
+          <w:tab w:val="left" w:pos="3135"/>
+        </w:tabs>
+      </w:pPr>
+    </w:p>
+    <w:p>
+      <w:pPr>
+        <w:tabs>
+          <w:tab w:val="left" w:pos="3135"/>
+        </w:tabs>
+      </w:pPr>
       <w:r>
         <w:t>Given the following:</w:t>
       </w:r>
     </w:p>
     <w:p>
-      <w:r>
-        <w:t>Virtual address</w:t>
-      </w:r>
-    </w:p>
-    <w:p>
-      <w:r>
-        <w:t>VPN – 4-bit VPN, 8-bit offset</w:t>
-      </w:r>
-    </w:p>
-    <w:p>
-      <w:r>
-        <w:t>Physical address</w:t>
-      </w:r>
-    </w:p>
-    <w:p>
-      <w:r>
-        <w:t>3bit PPN 8 bit offset</w:t>
-      </w:r>
-    </w:p>
-    <w:p>
-      <w:r>
-        <w:t>Determine the number of virtual pages Bytes/page?</w:t>
-      </w:r>
-    </w:p>
-    <w:p/>
-    <w:p>
-      <w:r>
-        <w:t xml:space="preserve"> bit VPN </w:t>
-      </w:r>
-      <w:r>
-        <w:sym w:font="Wingdings" w:char="F0E0"/>
-      </w:r>
-      <w:r>
-        <w:t xml:space="preserve"> </w:t>
-      </w:r>
-      <w:r>
-        <w:t>this determines the power you multiply by so:</w:t>
-      </w:r>
-    </w:p>
-    <w:p>
-      <w:r>
-        <w:t xml:space="preserve">4-bit VPN </w:t>
-      </w:r>
-      <w:r>
-        <w:sym w:font="Wingdings" w:char="F0E0"/>
-      </w:r>
-      <w:r>
-        <w:t xml:space="preserve"> </w:t>
-      </w:r>
-      <w:proofErr w:type="gramStart"/>
-      <w:r>
-        <w:t>2</w:t>
-      </w:r>
-      <w:r>
+      <w:pPr>
+        <w:tabs>
+          <w:tab w:val="left" w:pos="3135"/>
+        </w:tabs>
+      </w:pPr>
+    </w:p>
+    <w:p>
+      <w:pPr>
+        <w:tabs>
+          <w:tab w:val="left" w:pos="3135"/>
+        </w:tabs>
+      </w:pPr>
+      <w:r>
+        <w:t xml:space="preserve">Virtual address  </w:t>
+      </w:r>
+    </w:p>
+    <w:p>
+      <w:pPr>
+        <w:tabs>
+          <w:tab w:val="left" w:pos="3135"/>
+        </w:tabs>
+      </w:pPr>
+      <w:r>
+        <w:t xml:space="preserve">VPN – 4-bit VPN, 8-bit offset  </w:t>
+      </w:r>
+    </w:p>
+    <w:p>
+      <w:pPr>
+        <w:tabs>
+          <w:tab w:val="left" w:pos="3135"/>
+        </w:tabs>
+      </w:pPr>
+    </w:p>
+    <w:p>
+      <w:pPr>
+        <w:tabs>
+          <w:tab w:val="left" w:pos="3135"/>
+        </w:tabs>
+      </w:pPr>
+      <w:r>
+        <w:t xml:space="preserve">Physical address  </w:t>
+      </w:r>
+    </w:p>
+    <w:p>
+      <w:pPr>
+        <w:tabs>
+          <w:tab w:val="left" w:pos="3135"/>
+        </w:tabs>
+      </w:pPr>
+      <w:r>
+        <w:t xml:space="preserve">3-bit PPN, 8-bit offset  </w:t>
+      </w:r>
+    </w:p>
+    <w:p>
+      <w:pPr>
+        <w:tabs>
+          <w:tab w:val="left" w:pos="3135"/>
+        </w:tabs>
+      </w:pPr>
+    </w:p>
+    <w:p>
+      <w:pPr>
+        <w:tabs>
+          <w:tab w:val="left" w:pos="3135"/>
+        </w:tabs>
+      </w:pPr>
+      <w:r>
+        <w:t>Determine the number of virtual pages and bytes per page.</w:t>
+      </w:r>
+    </w:p>
+    <w:p>
+      <w:pPr>
+        <w:tabs>
+          <w:tab w:val="left" w:pos="3135"/>
+        </w:tabs>
+      </w:pPr>
+    </w:p>
+    <w:p>
+      <w:pPr>
+        <w:tabs>
+          <w:tab w:val="left" w:pos="3135"/>
+        </w:tabs>
+      </w:pPr>
+      <w:r>
+        <w:t>The VPN determines the power you multiply by:</w:t>
+      </w:r>
+    </w:p>
+    <w:p>
+      <w:pPr>
+        <w:tabs>
+          <w:tab w:val="left" w:pos="3135"/>
+        </w:tabs>
+      </w:pPr>
+    </w:p>
+    <w:p>
+      <w:pPr>
+        <w:tabs>
+          <w:tab w:val="left" w:pos="3135"/>
+        </w:tabs>
+      </w:pPr>
+      <w:r>
+        <w:t>4-bit VPN → 2^4 = 16</w:t>
+      </w:r>
+    </w:p>
+    <w:p>
+      <w:pPr>
+        <w:tabs>
+          <w:tab w:val="left" w:pos="3135"/>
+        </w:tabs>
+      </w:pPr>
+    </w:p>
+    <w:p>
+      <w:pPr>
+        <w:tabs>
+          <w:tab w:val="left" w:pos="3135"/>
+        </w:tabs>
+      </w:pPr>
+      <w:r>
+        <w:t>The bit offset also determines the power you multiply by:</w:t>
+      </w:r>
+    </w:p>
+    <w:p>
+      <w:pPr>
+        <w:tabs>
+          <w:tab w:val="left" w:pos="3135"/>
+        </w:tabs>
+      </w:pPr>
+    </w:p>
+    <w:p>
+      <w:pPr>
+        <w:tabs>
+          <w:tab w:val="left" w:pos="3135"/>
+        </w:tabs>
+      </w:pPr>
+      <w:r>
+        <w:t>8-bit offset → 2^8 = 256</w:t>
+      </w:r>
+    </w:p>
+    <w:p>
+      <w:pPr>
+        <w:tabs>
+          <w:tab w:val="left" w:pos="3135"/>
+        </w:tabs>
+      </w:pPr>
+    </w:p>
+    <w:p>
+      <w:pPr>
+        <w:tabs>
+          <w:tab w:val="left" w:pos="3135"/>
+        </w:tabs>
+      </w:pPr>
+      <w:r>
+        <w:t xml:space="preserve">Number of virtual pages = 16 pages  </w:t>
+      </w:r>
+    </w:p>
+    <w:p>
+      <w:pPr>
+        <w:tabs>
+          <w:tab w:val="left" w:pos="3135"/>
+        </w:tabs>
+      </w:pPr>
+      <w:r>
+        <w:t>Bytes per page = 256 bytes</w:t>
+      </w:r>
+    </w:p>
+    <w:p>
+      <w:pPr>
+        <w:tabs>
+          <w:tab w:val="left" w:pos="3135"/>
+        </w:tabs>
+      </w:pPr>
+    </w:p>
+    <w:p>
+      <w:pPr>
+        <w:tabs>
+          <w:tab w:val="left" w:pos="3135"/>
+        </w:tabs>
         <w:rPr>
-          <w:vertAlign w:val="superscript"/>
+          <w:b/>
+          <w:bCs/>
         </w:rPr>
-        <w:t xml:space="preserve">4 </w:t>
-      </w:r>
-      <w:r>
-        <w:t xml:space="preserve"> =</w:t>
-      </w:r>
-      <w:proofErr w:type="gramEnd"/>
-      <w:r>
-        <w:t xml:space="preserve"> 16</w:t>
-      </w:r>
-    </w:p>
-    <w:p>
-      <w:r>
-        <w:t xml:space="preserve">Bit offset </w:t>
-      </w:r>
-      <w:r>
-        <w:sym w:font="Wingdings" w:char="F0E0"/>
-      </w:r>
-      <w:r>
-        <w:t xml:space="preserve"> Also determines the power you multiply by so:</w:t>
-      </w:r>
-    </w:p>
-    <w:p>
-      <w:r>
-        <w:t xml:space="preserve">8-bit offset </w:t>
-      </w:r>
-      <w:r>
-        <w:sym w:font="Wingdings" w:char="F0E0"/>
-      </w:r>
-      <w:r>
-        <w:t xml:space="preserve"> 2</w:t>
-      </w:r>
+      </w:pPr>
       <w:r>
         <w:rPr>
-          <w:vertAlign w:val="superscript"/>
+          <w:b/>
+          <w:bCs/>
         </w:rPr>
-        <w:t>8</w:t>
-      </w:r>
-      <w:r>
-        <w:t xml:space="preserve"> = 265</w:t>
-      </w:r>
-    </w:p>
-    <w:p/>
-    <w:p>
-      <w:r>
-        <w:t xml:space="preserve">No. virtual pages = 16 pages </w:t>
-      </w:r>
-    </w:p>
-    <w:p>
-      <w:r>
-        <w:t>Bytes per page = 256 bytes</w:t>
-      </w:r>
-    </w:p>
-    <w:p/>
-    <w:p>
-      <w:r>
         <w:t>2)</w:t>
       </w:r>
     </w:p>
     <w:p>
+      <w:pPr>
+        <w:tabs>
+          <w:tab w:val="left" w:pos="3135"/>
+        </w:tabs>
+      </w:pPr>
+    </w:p>
+    <w:p>
+      <w:pPr>
+        <w:tabs>
+          <w:tab w:val="left" w:pos="3135"/>
+        </w:tabs>
+      </w:pPr>
       <w:r>
         <w:t>Virtual address = 0x2C8</w:t>
       </w:r>
     </w:p>
     <w:p>
+      <w:pPr>
+        <w:tabs>
+          <w:tab w:val="left" w:pos="3135"/>
+        </w:tabs>
+      </w:pPr>
+    </w:p>
+    <w:p>
+      <w:pPr>
+        <w:tabs>
+          <w:tab w:val="left" w:pos="3135"/>
+        </w:tabs>
+      </w:pPr>
       <w:r>
         <w:t>Finding the VPN:</w:t>
       </w:r>
     </w:p>
     <w:p>
       <w:pPr>
-        <w:pStyle w:val="ListParagraph"/>
-        <w:numPr>
-          <w:ilvl w:val="0"/>
-          <w:numId w:val="1"/>
-        </w:numPr>
-      </w:pPr>
-      <w:r>
-        <w:t>The first hexadecimal is the digit is the 4-bit VPN network</w:t>
-      </w:r>
-    </w:p>
-    <w:p>
-      <w:r>
-        <w:t xml:space="preserve">VPN = 0x2 </w:t>
-      </w:r>
-      <w:r>
-        <w:sym w:font="Wingdings" w:char="F0E0"/>
-      </w:r>
-      <w:r>
-        <w:t xml:space="preserve"> 2 look for this in the table</w:t>
-      </w:r>
-    </w:p>
-    <w:p>
-      <w:r>
-        <w:t xml:space="preserve">Offset = </w:t>
-      </w:r>
-      <w:r>
-        <w:t xml:space="preserve">0xC8 </w:t>
-      </w:r>
-    </w:p>
-    <w:p>
-      <w:r>
-        <w:t>This happens since 1 hexadecimal is 4 bits and the 2 is the first hexadecimal</w:t>
-      </w:r>
-    </w:p>
-    <w:p/>
-    <w:p>
-      <w:r>
-        <w:lastRenderedPageBreak/>
+        <w:tabs>
+          <w:tab w:val="left" w:pos="3135"/>
+        </w:tabs>
+      </w:pPr>
+    </w:p>
+    <w:p>
+      <w:pPr>
+        <w:tabs>
+          <w:tab w:val="left" w:pos="3135"/>
+        </w:tabs>
+      </w:pPr>
+      <w:r>
+        <w:t>The first hexadecimal digit is the 4-bit VPN value.</w:t>
+      </w:r>
+    </w:p>
+    <w:p>
+      <w:pPr>
+        <w:tabs>
+          <w:tab w:val="left" w:pos="3135"/>
+        </w:tabs>
+      </w:pPr>
+    </w:p>
+    <w:p>
+      <w:pPr>
+        <w:tabs>
+          <w:tab w:val="left" w:pos="3135"/>
+        </w:tabs>
+      </w:pPr>
+      <w:r>
+        <w:t xml:space="preserve">VPN = 0x2  </w:t>
+      </w:r>
+    </w:p>
+    <w:p>
+      <w:pPr>
+        <w:tabs>
+          <w:tab w:val="left" w:pos="3135"/>
+        </w:tabs>
+      </w:pPr>
+      <w:r>
+        <w:t>Offset = 0xC8</w:t>
+      </w:r>
+    </w:p>
+    <w:p>
+      <w:pPr>
+        <w:tabs>
+          <w:tab w:val="left" w:pos="3135"/>
+        </w:tabs>
+      </w:pPr>
+    </w:p>
+    <w:p>
+      <w:pPr>
+        <w:tabs>
+          <w:tab w:val="left" w:pos="3135"/>
+        </w:tabs>
+      </w:pPr>
+      <w:r>
+        <w:t>This happens because 1 hexadecimal digit represents 4 bits and the first hexadecimal digit is used for the VPN.</w:t>
+      </w:r>
+    </w:p>
+    <w:p>
+      <w:pPr>
+        <w:tabs>
+          <w:tab w:val="left" w:pos="3135"/>
+        </w:tabs>
+      </w:pPr>
+    </w:p>
+    <w:p>
+      <w:pPr>
+        <w:tabs>
+          <w:tab w:val="left" w:pos="3135"/>
+        </w:tabs>
+      </w:pPr>
+      <w:r>
         <w:t>The results from the page map:</w:t>
       </w:r>
     </w:p>
     <w:p>
-      <w:r>
-        <w:t>VPN:     D:     R:     PPN:</w:t>
-      </w:r>
-    </w:p>
-    <w:p>
-      <w:r>
-        <w:t xml:space="preserve">   2          0        1         4 </w:t>
-      </w:r>
-    </w:p>
-    <w:p/>
-    <w:p>
-      <w:r>
-        <w:t xml:space="preserve">PPN = </w:t>
-      </w:r>
-      <w:r>
-        <w:t>4, R</w:t>
-      </w:r>
-      <w:r>
-        <w:t xml:space="preserve"> (resident bit) = 1</w:t>
-      </w:r>
-      <w:r>
-        <w:t>,</w:t>
-      </w:r>
-      <w:r>
-        <w:t xml:space="preserve"> D (dirty bit) = 0</w:t>
-      </w:r>
-    </w:p>
-    <w:p/>
-    <w:p>
+      <w:pPr>
+        <w:tabs>
+          <w:tab w:val="left" w:pos="3135"/>
+        </w:tabs>
+      </w:pPr>
+    </w:p>
+    <w:p>
+      <w:pPr>
+        <w:tabs>
+          <w:tab w:val="left" w:pos="3135"/>
+        </w:tabs>
+      </w:pPr>
+      <w:r>
+        <w:t xml:space="preserve">VPN:     D:     R:     PPN:  </w:t>
+      </w:r>
+    </w:p>
+    <w:p>
+      <w:pPr>
+        <w:tabs>
+          <w:tab w:val="left" w:pos="3135"/>
+        </w:tabs>
+      </w:pPr>
+      <w:r>
+        <w:t xml:space="preserve">   </w:t>
+      </w:r>
+      <w:r>
+        <w:t>2           0       1         4</w:t>
+      </w:r>
+    </w:p>
+    <w:p>
+      <w:pPr>
+        <w:tabs>
+          <w:tab w:val="left" w:pos="3135"/>
+        </w:tabs>
+      </w:pPr>
+    </w:p>
+    <w:p>
+      <w:pPr>
+        <w:tabs>
+          <w:tab w:val="left" w:pos="3135"/>
+        </w:tabs>
+      </w:pPr>
+      <w:r>
+        <w:t>PPN = 4, R (resident bit) = 1, D (dirty bit) = 0</w:t>
+      </w:r>
+    </w:p>
+    <w:p>
+      <w:pPr>
+        <w:tabs>
+          <w:tab w:val="left" w:pos="3135"/>
+        </w:tabs>
+      </w:pPr>
+    </w:p>
+    <w:p>
+      <w:pPr>
+        <w:tabs>
+          <w:tab w:val="left" w:pos="3135"/>
+        </w:tabs>
+      </w:pPr>
       <w:r>
         <w:t>Final answer:</w:t>
       </w:r>
     </w:p>
     <w:p>
-      <w:r>
-        <w:t>VPN = 0x2</w:t>
-      </w:r>
-    </w:p>
-    <w:p>
-      <w:r>
-        <w:t>Offset = 0xC8</w:t>
-      </w:r>
-    </w:p>
-    <w:p>
-      <w:r>
-        <w:t xml:space="preserve">PPN = 0x4 </w:t>
-      </w:r>
-    </w:p>
-    <w:p/>
-    <w:p>
-      <w:pPr>
+      <w:pPr>
+        <w:tabs>
+          <w:tab w:val="left" w:pos="3135"/>
+        </w:tabs>
+      </w:pPr>
+    </w:p>
+    <w:p>
+      <w:pPr>
+        <w:tabs>
+          <w:tab w:val="left" w:pos="3135"/>
+        </w:tabs>
+      </w:pPr>
+      <w:r>
+        <w:t xml:space="preserve">VPN = 0x2  </w:t>
+      </w:r>
+    </w:p>
+    <w:p>
+      <w:pPr>
+        <w:tabs>
+          <w:tab w:val="left" w:pos="3135"/>
+        </w:tabs>
+      </w:pPr>
+      <w:r>
+        <w:t xml:space="preserve">Offset = 0xC8  </w:t>
+      </w:r>
+    </w:p>
+    <w:p>
+      <w:pPr>
+        <w:tabs>
+          <w:tab w:val="left" w:pos="3135"/>
+        </w:tabs>
+      </w:pPr>
+      <w:r>
+        <w:t>PPN = 0x4</w:t>
+      </w:r>
+    </w:p>
+    <w:p>
+      <w:pPr>
+        <w:tabs>
+          <w:tab w:val="left" w:pos="3135"/>
+        </w:tabs>
+      </w:pPr>
+    </w:p>
+    <w:p>
+      <w:pPr>
+        <w:tabs>
+          <w:tab w:val="left" w:pos="3135"/>
+        </w:tabs>
         <w:rPr>
           <w:b/>
           <w:bCs/>
@@ -291,757 +529,732 @@
       </w:r>
     </w:p>
     <w:p>
-      <w:r>
+      <w:pPr>
+        <w:tabs>
+          <w:tab w:val="left" w:pos="3135"/>
+        </w:tabs>
+      </w:pPr>
+    </w:p>
+    <w:p>
+      <w:pPr>
+        <w:tabs>
+          <w:tab w:val="left" w:pos="3135"/>
+        </w:tabs>
+      </w:pPr>
+      <w:r>
+        <w:lastRenderedPageBreak/>
         <w:t>Bottom of main memory = 32K</w:t>
       </w:r>
     </w:p>
     <w:p>
-      <w:r>
-        <w:t>It is split into 8 page frames all 4KB each</w:t>
-      </w:r>
-      <w:r>
-        <w:t xml:space="preserve"> = 4096 bytes </w:t>
-      </w:r>
-    </w:p>
-    <w:p>
-      <w:r>
-        <w:t>Since the memory address starts at 0 the calculation is: 0 + 4095</w:t>
-      </w:r>
-    </w:p>
-    <w:p/>
-    <w:p>
+      <w:pPr>
+        <w:tabs>
+          <w:tab w:val="left" w:pos="3135"/>
+        </w:tabs>
+      </w:pPr>
+    </w:p>
+    <w:p>
+      <w:pPr>
+        <w:tabs>
+          <w:tab w:val="left" w:pos="3135"/>
+        </w:tabs>
+      </w:pPr>
+      <w:r>
+        <w:t>It is split into 8 page frames all 4KB each = 4096 bytes.</w:t>
+      </w:r>
+    </w:p>
+    <w:p>
+      <w:pPr>
+        <w:tabs>
+          <w:tab w:val="left" w:pos="3135"/>
+        </w:tabs>
+      </w:pPr>
+    </w:p>
+    <w:p>
+      <w:pPr>
+        <w:tabs>
+          <w:tab w:val="left" w:pos="3135"/>
+        </w:tabs>
+      </w:pPr>
+      <w:r>
+        <w:t>Since the memory address starts at 0 the calculation is:</w:t>
+      </w:r>
+    </w:p>
+    <w:p>
+      <w:pPr>
+        <w:tabs>
+          <w:tab w:val="left" w:pos="3135"/>
+        </w:tabs>
+      </w:pPr>
+    </w:p>
+    <w:p>
+      <w:pPr>
+        <w:tabs>
+          <w:tab w:val="left" w:pos="3135"/>
+        </w:tabs>
+      </w:pPr>
+      <w:r>
+        <w:t>0 + 4095</w:t>
+      </w:r>
+    </w:p>
+    <w:p>
+      <w:pPr>
+        <w:tabs>
+          <w:tab w:val="left" w:pos="3135"/>
+        </w:tabs>
+      </w:pPr>
+    </w:p>
+    <w:p>
+      <w:pPr>
+        <w:tabs>
+          <w:tab w:val="left" w:pos="3135"/>
+        </w:tabs>
+      </w:pPr>
       <w:r>
         <w:t>Value of all the frames:</w:t>
       </w:r>
     </w:p>
     <w:p>
-      <w:r>
-        <w:t xml:space="preserve">0 </w:t>
-      </w:r>
-      <w:r>
-        <w:sym w:font="Wingdings" w:char="F0E0"/>
-      </w:r>
-      <w:r>
-        <w:t xml:space="preserve">  0</w:t>
-      </w:r>
-      <w:r>
-        <w:t xml:space="preserve"> +</w:t>
-      </w:r>
-      <w:r>
-        <w:t xml:space="preserve"> </w:t>
-      </w:r>
-      <w:r>
-        <w:t xml:space="preserve">4095 = </w:t>
-      </w:r>
-      <w:r>
+      <w:pPr>
+        <w:tabs>
+          <w:tab w:val="left" w:pos="3135"/>
+        </w:tabs>
+      </w:pPr>
+    </w:p>
+    <w:p>
+      <w:pPr>
+        <w:tabs>
+          <w:tab w:val="left" w:pos="3135"/>
+        </w:tabs>
+      </w:pPr>
+      <w:r>
+        <w:t xml:space="preserve">0 → 0 + 4095 = 4095 → D  </w:t>
+      </w:r>
+    </w:p>
+    <w:p>
+      <w:pPr>
+        <w:tabs>
+          <w:tab w:val="left" w:pos="3135"/>
+        </w:tabs>
+      </w:pPr>
+      <w:r>
+        <w:t xml:space="preserve">1 → 4096 + 4095 = 8191  </w:t>
+      </w:r>
+    </w:p>
+    <w:p>
+      <w:pPr>
+        <w:tabs>
+          <w:tab w:val="left" w:pos="3135"/>
+        </w:tabs>
+      </w:pPr>
+      <w:r>
+        <w:t xml:space="preserve">2 → 8192 + 4095 = 12,287  </w:t>
+      </w:r>
+    </w:p>
+    <w:p>
+      <w:pPr>
+        <w:tabs>
+          <w:tab w:val="left" w:pos="3135"/>
+        </w:tabs>
+      </w:pPr>
+      <w:r>
+        <w:t xml:space="preserve">3 → 12,288 + 4095 = 16,383 → C  </w:t>
+      </w:r>
+    </w:p>
+    <w:p>
+      <w:pPr>
+        <w:tabs>
+          <w:tab w:val="left" w:pos="3135"/>
+        </w:tabs>
+      </w:pPr>
+      <w:r>
+        <w:t xml:space="preserve">4 → 16,384 + 4095 = 20,479  </w:t>
+      </w:r>
+    </w:p>
+    <w:p>
+      <w:pPr>
+        <w:tabs>
+          <w:tab w:val="left" w:pos="3135"/>
+        </w:tabs>
+      </w:pPr>
+      <w:r>
+        <w:t xml:space="preserve">5 → 20,480 + 4095 = 24,575 → B  </w:t>
+      </w:r>
+    </w:p>
+    <w:p>
+      <w:pPr>
+        <w:tabs>
+          <w:tab w:val="left" w:pos="3135"/>
+        </w:tabs>
+      </w:pPr>
+      <w:r>
+        <w:t xml:space="preserve">6 → 24,576 + 4095 = 28,671  </w:t>
+      </w:r>
+    </w:p>
+    <w:p>
+      <w:pPr>
+        <w:tabs>
+          <w:tab w:val="left" w:pos="3135"/>
+        </w:tabs>
+      </w:pPr>
+      <w:r>
+        <w:t>7 → 28,672 + 4095 = 32,767 → A</w:t>
+      </w:r>
+    </w:p>
+    <w:p>
+      <w:pPr>
+        <w:tabs>
+          <w:tab w:val="left" w:pos="3135"/>
+        </w:tabs>
+      </w:pPr>
+    </w:p>
+    <w:p>
+      <w:pPr>
+        <w:tabs>
+          <w:tab w:val="left" w:pos="3135"/>
+        </w:tabs>
+      </w:pPr>
+      <w:r>
+        <w:t xml:space="preserve">A = 32,767  </w:t>
+      </w:r>
+    </w:p>
+    <w:p>
+      <w:pPr>
+        <w:tabs>
+          <w:tab w:val="left" w:pos="3135"/>
+        </w:tabs>
+      </w:pPr>
+      <w:r>
+        <w:t xml:space="preserve">B = 24,575  </w:t>
+      </w:r>
+    </w:p>
+    <w:p>
+      <w:pPr>
+        <w:tabs>
+          <w:tab w:val="left" w:pos="3135"/>
+        </w:tabs>
+      </w:pPr>
+      <w:r>
+        <w:t xml:space="preserve">C = 16,383  </w:t>
+      </w:r>
+    </w:p>
+    <w:p>
+      <w:pPr>
+        <w:tabs>
+          <w:tab w:val="left" w:pos="3135"/>
+        </w:tabs>
+      </w:pPr>
+      <w:r>
+        <w:t>D = 4095</w:t>
+      </w:r>
+    </w:p>
+    <w:p>
+      <w:pPr>
+        <w:tabs>
+          <w:tab w:val="left" w:pos="3135"/>
+        </w:tabs>
+      </w:pPr>
+    </w:p>
+    <w:p>
+      <w:pPr>
+        <w:tabs>
+          <w:tab w:val="left" w:pos="3135"/>
+        </w:tabs>
         <w:rPr>
           <w:b/>
           <w:bCs/>
         </w:rPr>
-        <w:t>4095</w:t>
-      </w:r>
+      </w:pPr>
       <w:r>
         <w:rPr>
           <w:b/>
           <w:bCs/>
         </w:rPr>
-        <w:t xml:space="preserve"> </w:t>
-      </w:r>
-      <w:r>
+        <w:t>Task 3:</w:t>
+      </w:r>
+    </w:p>
+    <w:p>
+      <w:pPr>
+        <w:tabs>
+          <w:tab w:val="left" w:pos="3135"/>
+        </w:tabs>
+      </w:pPr>
+    </w:p>
+    <w:p>
+      <w:pPr>
+        <w:tabs>
+          <w:tab w:val="left" w:pos="3135"/>
+        </w:tabs>
+      </w:pPr>
+      <w:r>
+        <w:t>Before solving the problems, I need to split the 32-bit virtual address:</w:t>
+      </w:r>
+    </w:p>
+    <w:p>
+      <w:pPr>
+        <w:tabs>
+          <w:tab w:val="left" w:pos="3135"/>
+        </w:tabs>
+      </w:pPr>
+    </w:p>
+    <w:p>
+      <w:pPr>
+        <w:tabs>
+          <w:tab w:val="left" w:pos="3135"/>
+        </w:tabs>
+      </w:pPr>
+      <w:r>
+        <w:lastRenderedPageBreak/>
+        <w:t>The page (the first 20 bits) = 00000000000000000011</w:t>
+      </w:r>
+    </w:p>
+    <w:p>
+      <w:pPr>
+        <w:tabs>
+          <w:tab w:val="left" w:pos="3135"/>
+        </w:tabs>
+      </w:pPr>
+    </w:p>
+    <w:p>
+      <w:pPr>
+        <w:tabs>
+          <w:tab w:val="left" w:pos="3135"/>
+        </w:tabs>
+      </w:pPr>
+      <w:r>
+        <w:t>The bit offset (the last 12 bits) = 000010110111</w:t>
+      </w:r>
+    </w:p>
+    <w:p>
+      <w:pPr>
+        <w:tabs>
+          <w:tab w:val="left" w:pos="3135"/>
+        </w:tabs>
+      </w:pPr>
+    </w:p>
+    <w:p>
+      <w:pPr>
+        <w:tabs>
+          <w:tab w:val="left" w:pos="3135"/>
+        </w:tabs>
         <w:rPr>
           <w:b/>
           <w:bCs/>
         </w:rPr>
-        <w:sym w:font="Wingdings" w:char="F0E0"/>
-      </w:r>
+      </w:pPr>
       <w:r>
         <w:rPr>
           <w:b/>
           <w:bCs/>
         </w:rPr>
-        <w:t xml:space="preserve">  D</w:t>
-      </w:r>
-    </w:p>
-    <w:p>
-      <w:pPr>
+        <w:t>3a)</w:t>
+      </w:r>
+    </w:p>
+    <w:p>
+      <w:pPr>
+        <w:tabs>
+          <w:tab w:val="left" w:pos="3135"/>
+        </w:tabs>
+      </w:pPr>
+    </w:p>
+    <w:p>
+      <w:pPr>
+        <w:tabs>
+          <w:tab w:val="left" w:pos="3135"/>
+        </w:tabs>
+      </w:pPr>
+      <w:r>
+        <w:t>Find the Virtual Page Number:</w:t>
+      </w:r>
+    </w:p>
+    <w:p>
+      <w:pPr>
+        <w:tabs>
+          <w:tab w:val="left" w:pos="3135"/>
+        </w:tabs>
+      </w:pPr>
+    </w:p>
+    <w:p>
+      <w:pPr>
+        <w:tabs>
+          <w:tab w:val="left" w:pos="3135"/>
+        </w:tabs>
+      </w:pPr>
+      <w:r>
+        <w:t>VPN bits = 00000000000000000011</w:t>
+      </w:r>
+    </w:p>
+    <w:p>
+      <w:pPr>
+        <w:tabs>
+          <w:tab w:val="left" w:pos="3135"/>
+        </w:tabs>
+      </w:pPr>
+    </w:p>
+    <w:p>
+      <w:pPr>
+        <w:tabs>
+          <w:tab w:val="left" w:pos="3135"/>
+        </w:tabs>
+      </w:pPr>
+      <w:r>
+        <w:t>Corresponding page number = 3</w:t>
+      </w:r>
+    </w:p>
+    <w:p>
+      <w:pPr>
+        <w:tabs>
+          <w:tab w:val="left" w:pos="3135"/>
+        </w:tabs>
+      </w:pPr>
+    </w:p>
+    <w:p>
+      <w:pPr>
+        <w:tabs>
+          <w:tab w:val="left" w:pos="3135"/>
+        </w:tabs>
+      </w:pPr>
+      <w:r>
+        <w:t>Virtual Page Number = 3</w:t>
+      </w:r>
+    </w:p>
+    <w:p>
+      <w:pPr>
+        <w:tabs>
+          <w:tab w:val="left" w:pos="3135"/>
+        </w:tabs>
+      </w:pPr>
+    </w:p>
+    <w:p>
+      <w:pPr>
+        <w:tabs>
+          <w:tab w:val="left" w:pos="3135"/>
+        </w:tabs>
         <w:rPr>
           <w:b/>
           <w:bCs/>
         </w:rPr>
       </w:pPr>
       <w:r>
-        <w:t xml:space="preserve">1 </w:t>
-      </w:r>
-      <w:r>
-        <w:sym w:font="Wingdings" w:char="F0E0"/>
-      </w:r>
-      <w:r>
-        <w:t xml:space="preserve">  4096</w:t>
-      </w:r>
-      <w:r>
-        <w:t xml:space="preserve"> + 4095 = </w:t>
-      </w:r>
-      <w:r>
         <w:rPr>
           <w:b/>
           <w:bCs/>
         </w:rPr>
-        <w:t>8191</w:t>
-      </w:r>
-    </w:p>
-    <w:p>
-      <w:pPr>
+        <w:t>3b)</w:t>
+      </w:r>
+    </w:p>
+    <w:p>
+      <w:pPr>
+        <w:tabs>
+          <w:tab w:val="left" w:pos="3135"/>
+        </w:tabs>
+      </w:pPr>
+    </w:p>
+    <w:p>
+      <w:pPr>
+        <w:tabs>
+          <w:tab w:val="left" w:pos="3135"/>
+        </w:tabs>
+      </w:pPr>
+      <w:r>
+        <w:t>Find the page frame value:</w:t>
+      </w:r>
+    </w:p>
+    <w:p>
+      <w:pPr>
+        <w:tabs>
+          <w:tab w:val="left" w:pos="3135"/>
+        </w:tabs>
+      </w:pPr>
+    </w:p>
+    <w:p>
+      <w:pPr>
+        <w:tabs>
+          <w:tab w:val="left" w:pos="3135"/>
+        </w:tabs>
+      </w:pPr>
+      <w:r>
+        <w:t>I need to look in the table for the row that has the Virtual Page Number at 3 which shows:</w:t>
+      </w:r>
+    </w:p>
+    <w:p>
+      <w:pPr>
+        <w:tabs>
+          <w:tab w:val="left" w:pos="3135"/>
+        </w:tabs>
+      </w:pPr>
+    </w:p>
+    <w:p>
+      <w:pPr>
+        <w:tabs>
+          <w:tab w:val="left" w:pos="3135"/>
+        </w:tabs>
+      </w:pPr>
+      <w:r>
+        <w:t xml:space="preserve">Virtual Page:     Present Bit:     Page Frame:  </w:t>
+      </w:r>
+    </w:p>
+    <w:p>
+      <w:pPr>
+        <w:tabs>
+          <w:tab w:val="left" w:pos="3135"/>
+        </w:tabs>
+      </w:pPr>
+      <w:r>
+        <w:t xml:space="preserve">           </w:t>
+      </w:r>
+      <w:r>
+        <w:t>3                            1                         011</w:t>
+      </w:r>
+    </w:p>
+    <w:p>
+      <w:pPr>
+        <w:tabs>
+          <w:tab w:val="left" w:pos="3135"/>
+        </w:tabs>
+      </w:pPr>
+    </w:p>
+    <w:p>
+      <w:pPr>
+        <w:tabs>
+          <w:tab w:val="left" w:pos="3135"/>
+        </w:tabs>
+      </w:pPr>
+      <w:r>
+        <w:t>How to find the Denary Page Frame Value:</w:t>
+      </w:r>
+    </w:p>
+    <w:p>
+      <w:pPr>
+        <w:tabs>
+          <w:tab w:val="left" w:pos="3135"/>
+        </w:tabs>
+      </w:pPr>
+    </w:p>
+    <w:p>
+      <w:pPr>
+        <w:tabs>
+          <w:tab w:val="left" w:pos="3135"/>
+        </w:tabs>
+      </w:pPr>
+      <w:r>
+        <w:t>Binary page value = 011</w:t>
+      </w:r>
+    </w:p>
+    <w:p>
+      <w:pPr>
+        <w:tabs>
+          <w:tab w:val="left" w:pos="3135"/>
+        </w:tabs>
+      </w:pPr>
+    </w:p>
+    <w:p>
+      <w:pPr>
+        <w:tabs>
+          <w:tab w:val="left" w:pos="3135"/>
+        </w:tabs>
+      </w:pPr>
+      <w:r>
+        <w:lastRenderedPageBreak/>
+        <w:t>And this means:</w:t>
+      </w:r>
+    </w:p>
+    <w:p>
+      <w:pPr>
+        <w:tabs>
+          <w:tab w:val="left" w:pos="3135"/>
+        </w:tabs>
+      </w:pPr>
+    </w:p>
+    <w:p>
+      <w:pPr>
+        <w:tabs>
+          <w:tab w:val="left" w:pos="3135"/>
+        </w:tabs>
+      </w:pPr>
+      <w:r>
+        <w:t xml:space="preserve">Bit:     </w:t>
+      </w:r>
+      <w:r>
+        <w:t xml:space="preserve">      </w:t>
+      </w:r>
+      <w:r>
+        <w:t xml:space="preserve">Value:  </w:t>
+      </w:r>
+    </w:p>
+    <w:p>
+      <w:pPr>
+        <w:tabs>
+          <w:tab w:val="left" w:pos="3135"/>
+        </w:tabs>
+      </w:pPr>
+      <w:r>
+        <w:t>0 × 2^</w:t>
+      </w:r>
+      <w:proofErr w:type="gramStart"/>
+      <w:r>
+        <w:t xml:space="preserve">2 </w:t>
+      </w:r>
+      <w:r>
+        <w:t xml:space="preserve"> </w:t>
+      </w:r>
+      <w:r>
+        <w:t>=</w:t>
+      </w:r>
+      <w:proofErr w:type="gramEnd"/>
+      <w:r>
+        <w:t xml:space="preserve"> </w:t>
+      </w:r>
+      <w:r>
+        <w:t xml:space="preserve"> </w:t>
+      </w:r>
+      <w:r>
+        <w:t xml:space="preserve">0  </w:t>
+      </w:r>
+    </w:p>
+    <w:p>
+      <w:pPr>
+        <w:tabs>
+          <w:tab w:val="left" w:pos="3135"/>
+        </w:tabs>
+      </w:pPr>
+      <w:r>
+        <w:t>1 × 2^</w:t>
+      </w:r>
+      <w:proofErr w:type="gramStart"/>
+      <w:r>
+        <w:t xml:space="preserve">1 </w:t>
+      </w:r>
+      <w:r>
+        <w:t xml:space="preserve"> </w:t>
+      </w:r>
+      <w:r>
+        <w:t>=</w:t>
+      </w:r>
+      <w:proofErr w:type="gramEnd"/>
+      <w:r>
+        <w:t xml:space="preserve"> </w:t>
+      </w:r>
+      <w:r>
+        <w:t xml:space="preserve"> </w:t>
+      </w:r>
+      <w:r>
+        <w:t xml:space="preserve">2  </w:t>
+      </w:r>
+    </w:p>
+    <w:p>
+      <w:pPr>
+        <w:tabs>
+          <w:tab w:val="left" w:pos="3135"/>
+        </w:tabs>
+      </w:pPr>
+      <w:r>
+        <w:t>1 × 2^</w:t>
+      </w:r>
+      <w:proofErr w:type="gramStart"/>
+      <w:r>
+        <w:t>0</w:t>
+      </w:r>
+      <w:r>
+        <w:t xml:space="preserve"> </w:t>
+      </w:r>
+      <w:r>
+        <w:t xml:space="preserve"> =</w:t>
+      </w:r>
+      <w:proofErr w:type="gramEnd"/>
+      <w:r>
+        <w:t xml:space="preserve"> </w:t>
+      </w:r>
+      <w:r>
+        <w:t xml:space="preserve"> </w:t>
+      </w:r>
+      <w:r>
+        <w:t>1</w:t>
+      </w:r>
+    </w:p>
+    <w:p>
+      <w:pPr>
+        <w:tabs>
+          <w:tab w:val="left" w:pos="3135"/>
+        </w:tabs>
+      </w:pPr>
+    </w:p>
+    <w:p>
+      <w:pPr>
+        <w:tabs>
+          <w:tab w:val="left" w:pos="3135"/>
+        </w:tabs>
+      </w:pPr>
+      <w:r>
+        <w:t>To find the value you do:</w:t>
+      </w:r>
+    </w:p>
+    <w:p>
+      <w:pPr>
+        <w:tabs>
+          <w:tab w:val="left" w:pos="3135"/>
+        </w:tabs>
+      </w:pPr>
+    </w:p>
+    <w:p>
+      <w:pPr>
+        <w:tabs>
+          <w:tab w:val="left" w:pos="3135"/>
+        </w:tabs>
+      </w:pPr>
+      <w:r>
+        <w:t>(0 × 4) + (1 × 2) + (1 × 1) = 3</w:t>
+      </w:r>
+    </w:p>
+    <w:p>
+      <w:pPr>
+        <w:tabs>
+          <w:tab w:val="left" w:pos="3135"/>
+        </w:tabs>
+      </w:pPr>
+    </w:p>
+    <w:p>
+      <w:pPr>
+        <w:tabs>
+          <w:tab w:val="left" w:pos="3135"/>
+        </w:tabs>
+      </w:pPr>
+      <w:r>
+        <w:t xml:space="preserve">Binary Page Frame Value = 011  </w:t>
+      </w:r>
+    </w:p>
+    <w:p>
+      <w:pPr>
+        <w:tabs>
+          <w:tab w:val="left" w:pos="3135"/>
+        </w:tabs>
+      </w:pPr>
+      <w:r>
+        <w:t>Denary Page Frame Value = 3</w:t>
+      </w:r>
+    </w:p>
+    <w:p>
+      <w:pPr>
+        <w:tabs>
+          <w:tab w:val="left" w:pos="3135"/>
+        </w:tabs>
+      </w:pPr>
+    </w:p>
+    <w:p>
+      <w:pPr>
+        <w:tabs>
+          <w:tab w:val="left" w:pos="3135"/>
+        </w:tabs>
         <w:rPr>
           <w:b/>
           <w:bCs/>
         </w:rPr>
       </w:pPr>
       <w:r>
-        <w:t xml:space="preserve">2 </w:t>
-      </w:r>
-      <w:r>
-        <w:sym w:font="Wingdings" w:char="F0E0"/>
-      </w:r>
-      <w:r>
-        <w:t xml:space="preserve">  </w:t>
-      </w:r>
-      <w:r>
-        <w:t>8192</w:t>
-      </w:r>
-      <w:r>
-        <w:t xml:space="preserve"> + 4095</w:t>
-      </w:r>
-      <w:r>
-        <w:t xml:space="preserve"> = </w:t>
-      </w:r>
-      <w:r>
         <w:rPr>
           <w:b/>
           <w:bCs/>
         </w:rPr>
-        <w:t>12,287</w:t>
-      </w:r>
-    </w:p>
-    <w:p>
-      <w:pPr>
-        <w:rPr>
-          <w:b/>
-          <w:bCs/>
-        </w:rPr>
-      </w:pPr>
-      <w:r>
-        <w:t xml:space="preserve">3 </w:t>
-      </w:r>
-      <w:r>
-        <w:sym w:font="Wingdings" w:char="F0E0"/>
-      </w:r>
-      <w:r>
-        <w:t xml:space="preserve"> </w:t>
-      </w:r>
-      <w:r>
-        <w:t xml:space="preserve"> </w:t>
-      </w:r>
-      <w:r>
-        <w:t>12</w:t>
-      </w:r>
-      <w:r>
-        <w:t>,</w:t>
-      </w:r>
-      <w:r>
-        <w:t>288</w:t>
-      </w:r>
-      <w:r>
-        <w:t xml:space="preserve"> + 4095</w:t>
-      </w:r>
-      <w:r>
-        <w:t xml:space="preserve"> = </w:t>
-      </w:r>
-      <w:r>
-        <w:rPr>
-          <w:b/>
-          <w:bCs/>
-        </w:rPr>
-        <w:t>16,383</w:t>
-      </w:r>
-      <w:r>
-        <w:rPr>
-          <w:b/>
-          <w:bCs/>
-        </w:rPr>
-        <w:t xml:space="preserve"> </w:t>
-      </w:r>
-      <w:r>
-        <w:rPr>
-          <w:b/>
-          <w:bCs/>
-        </w:rPr>
-        <w:sym w:font="Wingdings" w:char="F0E0"/>
-      </w:r>
-      <w:r>
-        <w:rPr>
-          <w:b/>
-          <w:bCs/>
-        </w:rPr>
-        <w:t xml:space="preserve">  C</w:t>
-      </w:r>
-    </w:p>
-    <w:p>
-      <w:pPr>
-        <w:rPr>
-          <w:b/>
-          <w:bCs/>
-        </w:rPr>
-      </w:pPr>
-      <w:r>
-        <w:t xml:space="preserve">4 </w:t>
-      </w:r>
-      <w:r>
-        <w:sym w:font="Wingdings" w:char="F0E0"/>
-      </w:r>
-      <w:r>
-        <w:t xml:space="preserve"> </w:t>
-      </w:r>
-      <w:r>
-        <w:t>16</w:t>
-      </w:r>
-      <w:r>
-        <w:t>,</w:t>
-      </w:r>
-      <w:r>
-        <w:t>384</w:t>
-      </w:r>
-      <w:r>
-        <w:t xml:space="preserve"> + 4095 = </w:t>
-      </w:r>
-      <w:r>
-        <w:rPr>
-          <w:b/>
-          <w:bCs/>
-        </w:rPr>
-        <w:t>20</w:t>
-      </w:r>
-      <w:r>
-        <w:rPr>
-          <w:b/>
-          <w:bCs/>
-        </w:rPr>
-        <w:t>,</w:t>
-      </w:r>
-      <w:r>
-        <w:rPr>
-          <w:b/>
-          <w:bCs/>
-        </w:rPr>
-        <w:t>479</w:t>
-      </w:r>
-    </w:p>
-    <w:p>
-      <w:pPr>
-        <w:rPr>
-          <w:b/>
-          <w:bCs/>
-        </w:rPr>
-      </w:pPr>
-      <w:r>
-        <w:t xml:space="preserve">5 </w:t>
-      </w:r>
-      <w:r>
-        <w:sym w:font="Wingdings" w:char="F0E0"/>
-      </w:r>
-      <w:r>
-        <w:t xml:space="preserve"> 20,480 + 4095 = </w:t>
-      </w:r>
-      <w:r>
-        <w:rPr>
-          <w:b/>
-          <w:bCs/>
-        </w:rPr>
-        <w:t>24</w:t>
-      </w:r>
-      <w:r>
-        <w:rPr>
-          <w:b/>
-          <w:bCs/>
-        </w:rPr>
-        <w:t>,</w:t>
-      </w:r>
-      <w:r>
-        <w:rPr>
-          <w:b/>
-          <w:bCs/>
-        </w:rPr>
-        <w:t>575</w:t>
-      </w:r>
-      <w:r>
-        <w:rPr>
-          <w:b/>
-          <w:bCs/>
-        </w:rPr>
-        <w:t xml:space="preserve"> </w:t>
-      </w:r>
-      <w:r>
-        <w:rPr>
-          <w:b/>
-          <w:bCs/>
-        </w:rPr>
-        <w:sym w:font="Wingdings" w:char="F0E0"/>
-      </w:r>
-      <w:r>
-        <w:rPr>
-          <w:b/>
-          <w:bCs/>
-        </w:rPr>
-        <w:t xml:space="preserve">  B</w:t>
-      </w:r>
-    </w:p>
-    <w:p>
-      <w:r>
-        <w:t xml:space="preserve">6 </w:t>
-      </w:r>
-      <w:r>
-        <w:sym w:font="Wingdings" w:char="F0E0"/>
-      </w:r>
-      <w:r>
-        <w:t xml:space="preserve"> 24,576 + 4095 = </w:t>
-      </w:r>
-      <w:r>
-        <w:rPr>
-          <w:b/>
-          <w:bCs/>
-        </w:rPr>
-        <w:t>28</w:t>
-      </w:r>
-      <w:r>
-        <w:rPr>
-          <w:b/>
-          <w:bCs/>
-        </w:rPr>
-        <w:t>,</w:t>
-      </w:r>
-      <w:r>
-        <w:rPr>
-          <w:b/>
-          <w:bCs/>
-        </w:rPr>
-        <w:t>671</w:t>
-      </w:r>
-      <w:r>
-        <w:rPr>
-          <w:b/>
-          <w:bCs/>
-        </w:rPr>
-        <w:t xml:space="preserve"> </w:t>
-      </w:r>
-    </w:p>
-    <w:p>
-      <w:pPr>
-        <w:rPr>
-          <w:b/>
-          <w:bCs/>
-        </w:rPr>
-      </w:pPr>
-      <w:r>
-        <w:t xml:space="preserve">7 </w:t>
-      </w:r>
-      <w:r>
-        <w:sym w:font="Wingdings" w:char="F0E0"/>
-      </w:r>
-      <w:r>
-        <w:t xml:space="preserve"> 28,672 + 4095 = </w:t>
-      </w:r>
-      <w:r>
-        <w:rPr>
-          <w:b/>
-          <w:bCs/>
-        </w:rPr>
-        <w:t>32</w:t>
-      </w:r>
-      <w:r>
-        <w:rPr>
-          <w:b/>
-          <w:bCs/>
-        </w:rPr>
-        <w:t>,</w:t>
-      </w:r>
-      <w:r>
-        <w:rPr>
-          <w:b/>
-          <w:bCs/>
-        </w:rPr>
-        <w:t>767</w:t>
-      </w:r>
-      <w:r>
-        <w:rPr>
-          <w:b/>
-          <w:bCs/>
-        </w:rPr>
-        <w:t xml:space="preserve">  </w:t>
-      </w:r>
-      <w:r>
-        <w:rPr>
-          <w:b/>
-          <w:bCs/>
-        </w:rPr>
-        <w:sym w:font="Wingdings" w:char="F0E0"/>
-      </w:r>
-      <w:r>
-        <w:rPr>
-          <w:b/>
-          <w:bCs/>
-        </w:rPr>
-        <w:t xml:space="preserve">  A</w:t>
-      </w:r>
-    </w:p>
-    <w:p>
-      <w:pPr>
-        <w:rPr>
-          <w:b/>
-          <w:bCs/>
-        </w:rPr>
-      </w:pPr>
-    </w:p>
-    <w:p>
-      <w:pPr>
-        <w:rPr>
-          <w:b/>
-          <w:bCs/>
-        </w:rPr>
-      </w:pPr>
-      <w:r>
-        <w:rPr>
-          <w:b/>
-          <w:bCs/>
-        </w:rPr>
-        <w:t xml:space="preserve">A = 32,767 B = 24,575 C = 16,383 D = 4095 </w:t>
-      </w:r>
-    </w:p>
-    <w:p>
-      <w:pPr>
-        <w:rPr>
-          <w:b/>
-          <w:bCs/>
-        </w:rPr>
-      </w:pPr>
-    </w:p>
-    <w:p>
-      <w:pPr>
-        <w:rPr>
-          <w:b/>
-          <w:bCs/>
-        </w:rPr>
-      </w:pPr>
-      <w:r>
-        <w:rPr>
-          <w:b/>
-          <w:bCs/>
-        </w:rPr>
-        <w:lastRenderedPageBreak/>
-        <w:t>Task 3:</w:t>
-      </w:r>
-    </w:p>
-    <w:p>
-      <w:pPr>
-        <w:rPr>
-          <w:b/>
-          <w:bCs/>
-        </w:rPr>
-      </w:pPr>
-    </w:p>
-    <w:p>
-      <w:r>
-        <w:t>Before solving the problems, I need to split the 32-bit VPN:</w:t>
-      </w:r>
-    </w:p>
-    <w:p>
-      <w:r>
-        <w:t xml:space="preserve">The page (the first 20 bits) = </w:t>
-      </w:r>
-      <w:r>
-        <w:t>00000000000000000011</w:t>
-      </w:r>
-    </w:p>
-    <w:p>
-      <w:r>
-        <w:t xml:space="preserve">The bit offset (the last 12 bits) = </w:t>
-      </w:r>
-      <w:r>
-        <w:t>000010110111</w:t>
-      </w:r>
-    </w:p>
-    <w:p/>
-    <w:p>
-      <w:r>
-        <w:t>3a)</w:t>
-      </w:r>
-    </w:p>
-    <w:p>
-      <w:r>
-        <w:t>Find the Virtual Page Number:</w:t>
-      </w:r>
-    </w:p>
-    <w:p>
-      <w:r>
-        <w:t xml:space="preserve">VPN bits = 11 </w:t>
-      </w:r>
-      <w:r>
-        <w:sym w:font="Wingdings" w:char="F0E0"/>
-      </w:r>
-      <w:r>
-        <w:t xml:space="preserve"> Corresponding page number for bits = 3</w:t>
-      </w:r>
-    </w:p>
-    <w:p/>
-    <w:p>
-      <w:pPr>
-        <w:tabs>
-          <w:tab w:val="left" w:pos="3135"/>
-        </w:tabs>
-      </w:pPr>
-      <w:r>
-        <w:t>Virtual Page Number = 3</w:t>
-      </w:r>
-      <w:r>
-        <w:tab/>
-      </w:r>
-    </w:p>
-    <w:p>
-      <w:pPr>
-        <w:tabs>
-          <w:tab w:val="left" w:pos="3135"/>
-        </w:tabs>
-      </w:pPr>
-    </w:p>
-    <w:p>
-      <w:pPr>
-        <w:tabs>
-          <w:tab w:val="left" w:pos="3135"/>
-        </w:tabs>
-      </w:pPr>
-      <w:r>
-        <w:t>3b)</w:t>
-      </w:r>
-    </w:p>
-    <w:p>
-      <w:pPr>
-        <w:tabs>
-          <w:tab w:val="left" w:pos="3135"/>
-        </w:tabs>
-      </w:pPr>
-      <w:r>
-        <w:t>Find the page frame value:</w:t>
-      </w:r>
-    </w:p>
-    <w:p>
-      <w:pPr>
-        <w:tabs>
-          <w:tab w:val="left" w:pos="3135"/>
-        </w:tabs>
-      </w:pPr>
-      <w:r>
-        <w:t>I need to look in the table for the row that has the Virtual Page Number at 3 which shows:</w:t>
-      </w:r>
-    </w:p>
-    <w:p>
-      <w:pPr>
-        <w:tabs>
-          <w:tab w:val="left" w:pos="3135"/>
-        </w:tabs>
-      </w:pPr>
-      <w:r>
-        <w:t>Virtual Page:     Present Bit:     Page Frame:</w:t>
-      </w:r>
-    </w:p>
-    <w:p>
-      <w:pPr>
-        <w:tabs>
-          <w:tab w:val="left" w:pos="3135"/>
-        </w:tabs>
-      </w:pPr>
-      <w:r>
-        <w:t xml:space="preserve">         3                             1                           011</w:t>
-      </w:r>
-    </w:p>
-    <w:p>
-      <w:pPr>
-        <w:tabs>
-          <w:tab w:val="left" w:pos="3135"/>
-        </w:tabs>
-      </w:pPr>
-    </w:p>
-    <w:p>
-      <w:pPr>
-        <w:tabs>
-          <w:tab w:val="left" w:pos="3135"/>
-        </w:tabs>
-      </w:pPr>
-      <w:r>
-        <w:t>How to find the De</w:t>
-      </w:r>
-      <w:r>
-        <w:t>nary</w:t>
-      </w:r>
-      <w:r>
-        <w:t xml:space="preserve"> Page Frame Value:</w:t>
-      </w:r>
-    </w:p>
-    <w:p>
-      <w:pPr>
-        <w:tabs>
-          <w:tab w:val="left" w:pos="3135"/>
-        </w:tabs>
-      </w:pPr>
-      <w:r>
-        <w:t xml:space="preserve">Binary page value = 11 </w:t>
-      </w:r>
-    </w:p>
-    <w:p>
-      <w:pPr>
-        <w:tabs>
-          <w:tab w:val="left" w:pos="3135"/>
-        </w:tabs>
-      </w:pPr>
-      <w:r>
-        <w:t>And this means:</w:t>
-      </w:r>
-    </w:p>
-    <w:p>
-      <w:pPr>
-        <w:tabs>
-          <w:tab w:val="left" w:pos="3135"/>
-        </w:tabs>
-      </w:pPr>
-      <w:r>
-        <w:t>Bit:     Value:</w:t>
-      </w:r>
-    </w:p>
-    <w:p>
-      <w:pPr>
-        <w:pStyle w:val="ListParagraph"/>
-        <w:numPr>
-          <w:ilvl w:val="0"/>
-          <w:numId w:val="2"/>
-        </w:numPr>
-        <w:tabs>
-          <w:tab w:val="left" w:pos="3135"/>
-        </w:tabs>
-      </w:pPr>
-      <w:r>
-        <w:t>2</w:t>
-      </w:r>
-      <w:r>
-        <w:rPr>
-          <w:vertAlign w:val="superscript"/>
-        </w:rPr>
-        <w:t>2</w:t>
-      </w:r>
-      <w:r>
-        <w:t xml:space="preserve"> = 4</w:t>
-      </w:r>
-    </w:p>
-    <w:p>
-      <w:pPr>
-        <w:pStyle w:val="ListParagraph"/>
-        <w:numPr>
-          <w:ilvl w:val="0"/>
-          <w:numId w:val="2"/>
-        </w:numPr>
-        <w:tabs>
-          <w:tab w:val="left" w:pos="3135"/>
-        </w:tabs>
-      </w:pPr>
-      <w:r>
-        <w:t>2</w:t>
-      </w:r>
-      <w:r>
-        <w:rPr>
-          <w:vertAlign w:val="superscript"/>
-        </w:rPr>
-        <w:t xml:space="preserve">1 </w:t>
-      </w:r>
-      <w:r>
-        <w:t>= 0</w:t>
-      </w:r>
-    </w:p>
-    <w:p>
-      <w:pPr>
-        <w:pStyle w:val="ListParagraph"/>
-        <w:numPr>
-          <w:ilvl w:val="0"/>
-          <w:numId w:val="2"/>
-        </w:numPr>
-        <w:tabs>
-          <w:tab w:val="left" w:pos="3135"/>
-        </w:tabs>
-      </w:pPr>
-      <w:r>
-        <w:t>2</w:t>
-      </w:r>
-      <w:r>
-        <w:rPr>
-          <w:vertAlign w:val="superscript"/>
-        </w:rPr>
-        <w:t>0</w:t>
-      </w:r>
-      <w:r>
-        <w:t xml:space="preserve"> = 1</w:t>
-      </w:r>
-    </w:p>
-    <w:p>
-      <w:pPr>
-        <w:tabs>
-          <w:tab w:val="left" w:pos="3135"/>
-        </w:tabs>
-      </w:pPr>
-      <w:r>
-        <w:t>To find the value you do (0 x 4) + (1 x 2) + (1 x 1) = 3</w:t>
-      </w:r>
-    </w:p>
-    <w:p>
-      <w:pPr>
-        <w:tabs>
-          <w:tab w:val="left" w:pos="3135"/>
-        </w:tabs>
-      </w:pPr>
-      <w:r>
-        <w:t xml:space="preserve">Binary Page Frame Value = </w:t>
-      </w:r>
-      <w:r>
-        <w:rPr>
-          <w:b/>
-          <w:bCs/>
-        </w:rPr>
-        <w:t>011</w:t>
-      </w:r>
-    </w:p>
-    <w:p>
-      <w:pPr>
-        <w:tabs>
-          <w:tab w:val="left" w:pos="3135"/>
-        </w:tabs>
-        <w:rPr>
-          <w:b/>
-          <w:bCs/>
-        </w:rPr>
-      </w:pPr>
-      <w:r>
-        <w:t xml:space="preserve">Denary Page Frame Value = </w:t>
-      </w:r>
-      <w:r>
-        <w:rPr>
-          <w:b/>
-          <w:bCs/>
-        </w:rPr>
-        <w:t>3</w:t>
-      </w:r>
-    </w:p>
-    <w:p>
-      <w:pPr>
-        <w:tabs>
-          <w:tab w:val="left" w:pos="3135"/>
-        </w:tabs>
-      </w:pPr>
-      <w:r>
-        <w:lastRenderedPageBreak/>
         <w:t>3c)</w:t>
       </w:r>
     </w:p>
@@ -1051,6 +1264,13 @@
           <w:tab w:val="left" w:pos="3135"/>
         </w:tabs>
       </w:pPr>
+    </w:p>
+    <w:p>
+      <w:pPr>
+        <w:tabs>
+          <w:tab w:val="left" w:pos="3135"/>
+        </w:tabs>
+      </w:pPr>
       <w:r>
         <w:t>I need to construct the Physical address:</w:t>
       </w:r>
@@ -1061,15 +1281,23 @@
           <w:tab w:val="left" w:pos="3135"/>
         </w:tabs>
       </w:pPr>
-      <w:r>
-        <w:t>To do this I take the page frame (011) and the offset (</w:t>
-      </w:r>
-      <w:r>
-        <w:t>000010110111</w:t>
-      </w:r>
-      <w:r>
-        <w:t>) and add them together.</w:t>
-      </w:r>
+    </w:p>
+    <w:p>
+      <w:pPr>
+        <w:tabs>
+          <w:tab w:val="left" w:pos="3135"/>
+        </w:tabs>
+      </w:pPr>
+      <w:r>
+        <w:t>To do this I take the page frame (011) and the offset (000010110111) and add them together.</w:t>
+      </w:r>
+    </w:p>
+    <w:p>
+      <w:pPr>
+        <w:tabs>
+          <w:tab w:val="left" w:pos="3135"/>
+        </w:tabs>
+      </w:pPr>
     </w:p>
     <w:p>
       <w:pPr>
@@ -1087,23 +1315,16 @@
           <w:tab w:val="left" w:pos="3135"/>
         </w:tabs>
       </w:pPr>
-      <w:r>
-        <w:t xml:space="preserve">Physical address = </w:t>
-      </w:r>
-      <w:r>
-        <w:t>011000010110111</w:t>
-      </w:r>
-    </w:p>
-    <w:p>
-      <w:pPr>
-        <w:tabs>
-          <w:tab w:val="left" w:pos="3135"/>
-        </w:tabs>
-        <w:rPr>
-          <w:b/>
-          <w:bCs/>
-        </w:rPr>
-      </w:pPr>
+    </w:p>
+    <w:p>
+      <w:pPr>
+        <w:tabs>
+          <w:tab w:val="left" w:pos="3135"/>
+        </w:tabs>
+      </w:pPr>
+      <w:r>
+        <w:t>Physical address = 011000010110111</w:t>
+      </w:r>
     </w:p>
     <w:p>
       <w:pPr>
@@ -1975,6 +2196,7 @@
   <w:style w:type="character" w:default="1" w:styleId="DefaultParagraphFont">
     <w:name w:val="Default Paragraph Font"/>
     <w:uiPriority w:val="1"/>
+    <w:semiHidden/>
     <w:unhideWhenUsed/>
   </w:style>
   <w:style w:type="table" w:default="1" w:styleId="TableNormal">

</xml_diff>